<commit_message>
Match font/color of Anzahlung note to body text
The invoice-note line ("Für die Anzahlung wird eine separate Rechnung
erstellt...") in the Zahlungsbedingungen block rendered off from the
surrounding body text:

- docx offer templates: the SelfPayLines loop had no explicit
  rFonts/color on its runs, so it fell back to the style default
  (Calibri/auto) instead of the Open Sans/#030303 used everywhere else
  in the document.
- online signing page: the interactive payment block rendered this
  line with the "muted" class and an explicit 10.5pt override instead
  of the default body color/size.

Fixed both so the note matches the rest of the body.
Co-Authored-By: Claude Sonnet 5 <noreply@anthropic.com>
</commit_message>
<xml_diff>
--- a/src/templates/Angebot-10.docx
+++ b/src/templates/Angebot-10.docx
@@ -3270,13 +3270,17 @@
       </w:r>
       <w:r>
         <w:rPr>
+          <w:rFonts w:ascii="Open Sans" w:hAnsi="Open Sans" w:eastAsia="Open Sans" w:cs="Open Sans"/>
           <w:b/>
+          <w:color w:val="030303"/>
           <w:lang w:val="de-DE"/>
         </w:rPr>
         <w:t>{Text}</w:t>
       </w:r>
       <w:r>
         <w:rPr>
+          <w:rFonts w:ascii="Open Sans" w:hAnsi="Open Sans" w:eastAsia="Open Sans" w:cs="Open Sans"/>
+          <w:color w:val="030303"/>
           <w:lang w:val="de-DE"/>
         </w:rPr>
         <w:t>{/IsTitle}{^IsTitle}{Text}{/IsTitle}{/SelfPayLines}</w:t>

</xml_diff>

<commit_message>
feat(angebot): Vermieter-Genehmigung checkbox + "Wichtige Hinweise" block
- Kundendaten (BU/BWT): new checkbox "Genehmigung des Vermieters erforderlich",
  prefilled from the Bitrix deal (list field UF_CRM_1791270927983, landlord
  file field, fallback "Wohnsituation:" line in Auftragsbeschreibung)
- Offer DOCX (BU SZ/KK, BWT, HL) + BU online signing: restructured
  "Wichtige Hinweise" bullet list incl. Vermieter and Pflegekasse sentences
- New template flags VermieterZustimmungHinweis, IsKassenkunde; ebenerdig
  note off for BWT/HL/BL
- Docs: docs/vermieter-genehmigung.md (rules, field IDs, n8n instructions)

Co-Authored-By: Claude Opus 5.5 <noreply@anthropic.com>
</commit_message>
<xml_diff>
--- a/src/templates/Angebot-10.docx
+++ b/src/templates/Angebot-10.docx
@@ -28,7 +28,7 @@
         <mc:AlternateContent>
           <mc:Choice Requires="wps">
             <w:drawing>
-              <wp:anchor behindDoc="0" distT="72390" distB="72390" distL="71755" distR="72390" simplePos="0" locked="0" layoutInCell="0" allowOverlap="1" relativeHeight="5">
+              <wp:anchor behindDoc="0" distT="72390" distB="72390" distL="70485" distR="72390" simplePos="0" locked="0" layoutInCell="0" allowOverlap="1" relativeHeight="5">
                 <wp:simplePos x="0" y="0"/>
                 <wp:positionH relativeFrom="page">
                   <wp:posOffset>720090</wp:posOffset>
@@ -134,8 +134,8 @@
                               <w:tblLook w:val="04a0" w:noVBand="1" w:noHBand="0" w:lastColumn="0" w:firstColumn="1" w:lastRow="0" w:firstRow="1"/>
                             </w:tblPr>
                             <w:tblGrid>
-                              <w:gridCol w:w="4798"/>
-                              <w:gridCol w:w="2402"/>
+                              <w:gridCol w:w="4796"/>
+                              <w:gridCol w:w="2404"/>
                               <w:gridCol w:w="2835"/>
                             </w:tblGrid>
                             <w:tr>
@@ -144,7 +144,7 @@
                               </w:trPr>
                               <w:tc>
                                 <w:tcPr>
-                                  <w:tcW w:w="4798" w:type="dxa"/>
+                                  <w:tcW w:w="4796" w:type="dxa"/>
                                   <w:tcBorders>
                                     <w:top w:val="single" w:sz="8" w:space="0" w:color="FFFFFF"/>
                                     <w:left w:val="single" w:sz="8" w:space="0" w:color="FFFFFF"/>
@@ -248,7 +248,7 @@
                               </w:tc>
                               <w:tc>
                                 <w:tcPr>
-                                  <w:tcW w:w="2402" w:type="dxa"/>
+                                  <w:tcW w:w="2404" w:type="dxa"/>
                                   <w:tcBorders>
                                     <w:top w:val="single" w:sz="8" w:space="0" w:color="FFFFFF"/>
                                     <w:left w:val="single" w:sz="8" w:space="0" w:color="FFFFFF"/>
@@ -639,7 +639,9 @@
                               </w:rPr>
                             </w:pPr>
                             <w:r>
-                              <w:rPr/>
+                              <w:rPr>
+                                <w:color w:val="000000"/>
+                              </w:rPr>
                             </w:r>
                           </w:p>
                         </w:txbxContent>
@@ -727,8 +729,8 @@
                         <w:tblLook w:val="04a0" w:noVBand="1" w:noHBand="0" w:lastColumn="0" w:firstColumn="1" w:lastRow="0" w:firstRow="1"/>
                       </w:tblPr>
                       <w:tblGrid>
-                        <w:gridCol w:w="4798"/>
-                        <w:gridCol w:w="2402"/>
+                        <w:gridCol w:w="4796"/>
+                        <w:gridCol w:w="2404"/>
                         <w:gridCol w:w="2835"/>
                       </w:tblGrid>
                       <w:tr>
@@ -737,7 +739,7 @@
                         </w:trPr>
                         <w:tc>
                           <w:tcPr>
-                            <w:tcW w:w="4798" w:type="dxa"/>
+                            <w:tcW w:w="4796" w:type="dxa"/>
                             <w:tcBorders>
                               <w:top w:val="single" w:sz="8" w:space="0" w:color="FFFFFF"/>
                               <w:left w:val="single" w:sz="8" w:space="0" w:color="FFFFFF"/>
@@ -841,7 +843,7 @@
                         </w:tc>
                         <w:tc>
                           <w:tcPr>
-                            <w:tcW w:w="2402" w:type="dxa"/>
+                            <w:tcW w:w="2404" w:type="dxa"/>
                             <w:tcBorders>
                               <w:top w:val="single" w:sz="8" w:space="0" w:color="FFFFFF"/>
                               <w:left w:val="single" w:sz="8" w:space="0" w:color="FFFFFF"/>
@@ -1232,7 +1234,9 @@
                         </w:rPr>
                       </w:pPr>
                       <w:r>
-                        <w:rPr/>
+                        <w:rPr>
+                          <w:color w:val="000000"/>
+                        </w:rPr>
                       </w:r>
                     </w:p>
                   </w:txbxContent>
@@ -1369,8 +1373,8 @@
         <w:gridCol w:w="479"/>
         <w:gridCol w:w="829"/>
         <w:gridCol w:w="5503"/>
-        <w:gridCol w:w="1352"/>
-        <w:gridCol w:w="1180"/>
+        <w:gridCol w:w="1351"/>
+        <w:gridCol w:w="1181"/>
       </w:tblGrid>
       <w:tr>
         <w:trPr>
@@ -1474,7 +1478,7 @@
         </w:tc>
         <w:tc>
           <w:tcPr>
-            <w:tcW w:w="1352" w:type="dxa"/>
+            <w:tcW w:w="1351" w:type="dxa"/>
             <w:tcBorders/>
             <w:shd w:color="auto" w:fill="CCCCCC" w:val="clear"/>
           </w:tcPr>
@@ -1503,7 +1507,7 @@
         </w:tc>
         <w:tc>
           <w:tcPr>
-            <w:tcW w:w="1180" w:type="dxa"/>
+            <w:tcW w:w="1181" w:type="dxa"/>
             <w:tcBorders/>
             <w:shd w:color="auto" w:fill="CCCCCC" w:val="clear"/>
           </w:tcPr>
@@ -1632,7 +1636,7 @@
         </w:tc>
         <w:tc>
           <w:tcPr>
-            <w:tcW w:w="1352" w:type="dxa"/>
+            <w:tcW w:w="1351" w:type="dxa"/>
             <w:tcBorders/>
             <w:shd w:color="auto" w:fill="FFFFFF" w:val="clear"/>
           </w:tcPr>
@@ -1662,7 +1666,7 @@
         </w:tc>
         <w:tc>
           <w:tcPr>
-            <w:tcW w:w="1180" w:type="dxa"/>
+            <w:tcW w:w="1181" w:type="dxa"/>
             <w:tcBorders/>
             <w:shd w:color="auto" w:fill="FFFFFF" w:val="clear"/>
           </w:tcPr>
@@ -2038,7 +2042,7 @@
         </w:tc>
         <w:tc>
           <w:tcPr>
-            <w:tcW w:w="1352" w:type="dxa"/>
+            <w:tcW w:w="1351" w:type="dxa"/>
             <w:tcBorders/>
             <w:shd w:color="auto" w:fill="FFFFFF" w:val="clear"/>
             <w:tcMar>
@@ -2068,7 +2072,7 @@
         </w:tc>
         <w:tc>
           <w:tcPr>
-            <w:tcW w:w="1180" w:type="dxa"/>
+            <w:tcW w:w="1181" w:type="dxa"/>
             <w:tcBorders/>
             <w:shd w:color="auto" w:fill="FFFFFF" w:val="clear"/>
             <w:tcMar>
@@ -2143,8 +2147,8 @@
         <w:gridCol w:w="479"/>
         <w:gridCol w:w="829"/>
         <w:gridCol w:w="5503"/>
-        <w:gridCol w:w="1352"/>
-        <w:gridCol w:w="1180"/>
+        <w:gridCol w:w="1351"/>
+        <w:gridCol w:w="1181"/>
       </w:tblGrid>
       <w:tr>
         <w:trPr>
@@ -2252,7 +2256,7 @@
         </w:tc>
         <w:tc>
           <w:tcPr>
-            <w:tcW w:w="1352" w:type="dxa"/>
+            <w:tcW w:w="1351" w:type="dxa"/>
             <w:tcBorders/>
             <w:shd w:color="auto" w:fill="FFFFFF" w:val="clear"/>
           </w:tcPr>
@@ -2284,7 +2288,7 @@
         </w:tc>
         <w:tc>
           <w:tcPr>
-            <w:tcW w:w="1180" w:type="dxa"/>
+            <w:tcW w:w="1181" w:type="dxa"/>
             <w:tcBorders/>
             <w:shd w:color="auto" w:fill="FFFFFF" w:val="clear"/>
             <w:tcMar>
@@ -2538,7 +2542,7 @@
         </w:tc>
         <w:tc>
           <w:tcPr>
-            <w:tcW w:w="1352" w:type="dxa"/>
+            <w:tcW w:w="1351" w:type="dxa"/>
             <w:tcBorders/>
             <w:shd w:color="auto" w:fill="FFFFFF" w:val="clear"/>
           </w:tcPr>
@@ -2564,7 +2568,7 @@
         </w:tc>
         <w:tc>
           <w:tcPr>
-            <w:tcW w:w="1180" w:type="dxa"/>
+            <w:tcW w:w="1181" w:type="dxa"/>
             <w:tcBorders/>
             <w:shd w:color="auto" w:fill="FFFFFF" w:val="clear"/>
             <w:vAlign w:val="center"/>
@@ -2722,7 +2726,7 @@
         </w:tc>
         <w:tc>
           <w:tcPr>
-            <w:tcW w:w="1352" w:type="dxa"/>
+            <w:tcW w:w="1351" w:type="dxa"/>
             <w:tcBorders/>
             <w:shd w:color="auto" w:fill="FFFFFF" w:val="clear"/>
           </w:tcPr>
@@ -2752,7 +2756,7 @@
         </w:tc>
         <w:tc>
           <w:tcPr>
-            <w:tcW w:w="1180" w:type="dxa"/>
+            <w:tcW w:w="1181" w:type="dxa"/>
             <w:tcBorders/>
             <w:shd w:color="auto" w:fill="FFFFFF" w:val="clear"/>
           </w:tcPr>
@@ -3105,108 +3109,20 @@
     <w:p>
       <w:pPr>
         <w:pStyle w:val="Normal"/>
-        <w:ind w:left="125"/>
+        <w:widowControl w:val="false"/>
+        <w:suppressAutoHyphens w:val="true"/>
+        <w:bidi w:val="0"/>
+        <w:spacing w:lineRule="auto" w:line="286" w:before="170" w:after="0"/>
+        <w:ind w:hanging="0" w:left="0" w:right="0"/>
+        <w:jc w:val="left"/>
         <w:rPr>
           <w:rFonts w:ascii="Open Sans" w:hAnsi="Open Sans" w:eastAsia="Open Sans" w:cs="Open Sans"/>
-          <w:color w:val="000000"/>
-          <w:lang w:val="de-DE"/>
-        </w:rPr>
-      </w:pPr>
-      <w:r>
-        <w:rPr>
-          <w:rFonts w:eastAsia="Open Sans" w:cs="Open Sans" w:ascii="Open Sans" w:hAnsi="Open Sans"/>
-          <w:color w:val="030303"/>
-          <w:lang w:val="de-DE"/>
-        </w:rPr>
-        <w:t>Es handelt sich hierbei um ein Festpreisangebot für die oben definierten Leistungen. Für eine Teilbeauftragung wäre ein neues Angebot erforderlich.{#EbenerdigHinweis}</w:t>
-      </w:r>
-    </w:p>
-    <w:p>
-      <w:pPr>
-        <w:pStyle w:val="normal1"/>
-        <w:spacing w:before="23" w:after="0"/>
-        <w:rPr>
-          <w:rFonts w:ascii="Open Sans" w:hAnsi="Open Sans" w:eastAsia="Open Sans" w:cs="Open Sans"/>
-          <w:color w:val="000000"/>
-          <w:lang w:val="de-DE"/>
-        </w:rPr>
-      </w:pPr>
-      <w:r>
-        <w:rPr>
-          <w:rFonts w:eastAsia="Open Sans" w:cs="Open Sans" w:ascii="Open Sans" w:hAnsi="Open Sans"/>
-          <w:color w:val="000000"/>
-          <w:lang w:val="de-DE"/>
-        </w:rPr>
-      </w:r>
-    </w:p>
-    <w:p>
-      <w:pPr>
-        <w:pStyle w:val="Normal"/>
-        <w:spacing w:lineRule="auto" w:line="286"/>
-        <w:ind w:left="123"/>
-        <w:rPr>
-          <w:rFonts w:ascii="Open Sans" w:hAnsi="Open Sans" w:eastAsia="Open Sans" w:cs="Open Sans"/>
-          <w:color w:val="000000"/>
-          <w:lang w:val="de-DE"/>
-        </w:rPr>
-      </w:pPr>
-      <w:r>
-        <w:rPr>
-          <w:rFonts w:eastAsia="Open Sans Semibold" w:cs="Open Sans Semibold" w:ascii="Open Sans Semibold" w:hAnsi="Open Sans Semibold"/>
-          <w:color w:val="030303"/>
-          <w:lang w:val="de-DE"/>
-        </w:rPr>
-        <w:t>HINWEIS:</w:t>
-      </w:r>
-      <w:r>
-        <w:rPr>
-          <w:rFonts w:eastAsia="Open Sans" w:cs="Open Sans" w:ascii="Open Sans" w:hAnsi="Open Sans"/>
-          <w:color w:val="030303"/>
-          <w:lang w:val="de-DE"/>
-        </w:rPr>
-        <w:t xml:space="preserve"> Ob eine ebenerdige Montage der Duschwanne möglich ist, kann erst nach dem Ausbau der bestehenden Wanne beurteilen werden. Sollten dabei zusätzliche oder weitere Leistungen erforderlich oder von Ihnen gewünscht sein, können zusätzliche Kosten entstehen.{/EbenerdigHinweis}</w:t>
-      </w:r>
-      <w:r>
-        <w:rPr>
-          <w:lang w:val="de-DE"/>
-        </w:rPr>
-        <w:br/>
-      </w:r>
-    </w:p>
-    <w:p>
-      <w:pPr>
-        <w:pStyle w:val="Normal"/>
-        <w:spacing w:lineRule="auto" w:line="283"/>
-        <w:ind w:left="125" w:right="1024"/>
-        <w:rPr>
-          <w:rFonts w:ascii="Open Sans" w:hAnsi="Open Sans" w:eastAsia="Open Sans" w:cs="Open Sans"/>
+          <w:b/>
+          <w:bCs/>
           <w:color w:val="030303"/>
           <w:lang w:val="de-DE"/>
         </w:rPr>
       </w:pPr>
-      <w:r>
-        <w:rPr>
-          <w:rFonts w:eastAsia="Open Sans" w:cs="Open Sans" w:ascii="Open Sans" w:hAnsi="Open Sans"/>
-          <w:color w:val="030303"/>
-          <w:lang w:val="de-DE"/>
-        </w:rPr>
-        <w:t>Diese werden vorab mit Ihnen besprochen, bedürfen lhrer Zustimmung und werden auf Regiebasis nach tatsächlichem Aufwand abgerechnet. (Stundensatz-Facharbeiter: {RegieRateFmt} netto){#hasSubsidyLine}</w:t>
-      </w:r>
-      <w:r>
-        <w:rPr>
-          <w:lang w:val="de-DE"/>
-        </w:rPr>
-        <w:br/>
-        <w:br/>
-      </w:r>
-      <w:r>
-        <w:rPr>
-          <w:rFonts w:eastAsia="Open Sans" w:cs="Open Sans" w:ascii="Open Sans" w:hAnsi="Open Sans"/>
-          <w:color w:val="030303"/>
-          <w:lang w:val="de-DE"/>
-        </w:rPr>
-        <w:t xml:space="preserve">Der Selbstkostenanteil beträgt </w:t>
-      </w:r>
       <w:r>
         <w:rPr>
           <w:rFonts w:eastAsia="Open Sans" w:cs="Open Sans" w:ascii="Open Sans" w:hAnsi="Open Sans"/>
@@ -3215,33 +3131,107 @@
           <w:color w:val="030303"/>
           <w:lang w:val="de-DE"/>
         </w:rPr>
-        <w:t>{SelbstkostenanteilFmt}</w:t>
+        <w:t>Wichtige Hinweise:</w:t>
       </w:r>
+    </w:p>
+    <w:p>
+      <w:pPr>
+        <w:pStyle w:val="Normal"/>
+        <w:widowControl w:val="false"/>
+        <w:numPr>
+          <w:ilvl w:val="3"/>
+          <w:numId w:val="1"/>
+        </w:numPr>
+        <w:suppressAutoHyphens w:val="true"/>
+        <w:bidi w:val="0"/>
+        <w:spacing w:lineRule="auto" w:line="286" w:before="170" w:after="0"/>
+        <w:ind w:hanging="283" w:left="340" w:right="0"/>
+        <w:jc w:val="left"/>
+        <w:rPr>
+          <w:rFonts w:ascii="Open Sans" w:hAnsi="Open Sans"/>
+        </w:rPr>
+      </w:pPr>
       <w:r>
         <w:rPr>
-          <w:rFonts w:eastAsia="Open Sans" w:cs="Open Sans" w:ascii="Open Sans" w:hAnsi="Open Sans"/>
-          <w:color w:val="030303"/>
+          <w:rFonts w:ascii="Open Sans" w:hAnsi="Open Sans"/>
           <w:lang w:val="de-DE"/>
         </w:rPr>
-        <w:t xml:space="preserve"> unter Berücksichtigung eines gewährten Zuschusses durch die Pflegekasse i.H.v. </w:t>
+        <w:t>Es handelt sich hierbei um ein Festpreisangebot für die oben definierten Leistungen. Für eine Teilbeauftragung wäre ein neues Angebot erforderlich.{#hasSubsidyLine}</w:t>
       </w:r>
+    </w:p>
+    <w:p>
+      <w:pPr>
+        <w:pStyle w:val="Normal"/>
+        <w:widowControl w:val="false"/>
+        <w:numPr>
+          <w:ilvl w:val="3"/>
+          <w:numId w:val="1"/>
+        </w:numPr>
+        <w:suppressAutoHyphens w:val="true"/>
+        <w:bidi w:val="0"/>
+        <w:spacing w:lineRule="auto" w:line="286" w:before="170" w:after="0"/>
+        <w:ind w:hanging="283" w:left="340" w:right="0"/>
+        <w:jc w:val="left"/>
+        <w:rPr>
+          <w:rFonts w:ascii="Open Sans" w:hAnsi="Open Sans"/>
+        </w:rPr>
+      </w:pPr>
       <w:r>
         <w:rPr>
-          <w:rFonts w:eastAsia="Open Sans" w:cs="Open Sans" w:ascii="Open Sans" w:hAnsi="Open Sans"/>
-          <w:b/>
-          <w:bCs/>
-          <w:color w:val="030303"/>
+          <w:rFonts w:ascii="Open Sans" w:hAnsi="Open Sans"/>
           <w:lang w:val="de-DE"/>
         </w:rPr>
-        <w:t>{Zuschusskrankenkasse}</w:t>
+        <w:t>Ihr Eigenanteil beträgt {SelbstkostenanteilFmt} unter Berücksichtigung eines gewährten Zuschusses durch die Pflegekasse i.H.v. {Zuschusskrankenkasse}.{/hasSubsidyLine}{#EbenerdigHinweis}</w:t>
       </w:r>
+    </w:p>
+    <w:p>
+      <w:pPr>
+        <w:pStyle w:val="Normal"/>
+        <w:widowControl w:val="false"/>
+        <w:numPr>
+          <w:ilvl w:val="3"/>
+          <w:numId w:val="1"/>
+        </w:numPr>
+        <w:suppressAutoHyphens w:val="true"/>
+        <w:bidi w:val="0"/>
+        <w:spacing w:lineRule="auto" w:line="286" w:before="170" w:after="0"/>
+        <w:ind w:hanging="283" w:left="340" w:right="0"/>
+        <w:jc w:val="left"/>
+        <w:rPr>
+          <w:rFonts w:ascii="Open Sans" w:hAnsi="Open Sans"/>
+        </w:rPr>
+      </w:pPr>
       <w:r>
         <w:rPr>
-          <w:rFonts w:eastAsia="Open Sans" w:cs="Open Sans" w:ascii="Open Sans" w:hAnsi="Open Sans"/>
-          <w:color w:val="030303"/>
+          <w:rFonts w:ascii="Open Sans" w:hAnsi="Open Sans"/>
           <w:lang w:val="de-DE"/>
         </w:rPr>
-        <w:t>.{/hasSubsidyLine}</w:t>
+        <w:t>Ob eine ebenerdige Montage der Duschwanne möglich ist, kann erst nach dem Ausbau der bestehenden Wanne beurteilt werden. Sollten dabei zusätzliche oder weitere Leistungen erforderlich oder von Ihnen gewünscht sein, können zusätzliche Kosten entstehen. Diese werden vorab mit Ihnen besprochen, bedürfen Ihrer Zustimmung und werden auf Regiebasis nach tatsächlichem Aufwand abgerechnet. (Stundensatz-Facharbeiter: {RegieRateFmt} netto){/EbenerdigHinweis}{#VermieterZustimmungHinweis}</w:t>
+      </w:r>
+    </w:p>
+    <w:p>
+      <w:pPr>
+        <w:pStyle w:val="Normal"/>
+        <w:widowControl w:val="false"/>
+        <w:numPr>
+          <w:ilvl w:val="3"/>
+          <w:numId w:val="1"/>
+        </w:numPr>
+        <w:suppressAutoHyphens w:val="true"/>
+        <w:bidi w:val="0"/>
+        <w:spacing w:lineRule="auto" w:line="286" w:before="170" w:after="0"/>
+        <w:ind w:hanging="283" w:left="340" w:right="0"/>
+        <w:jc w:val="left"/>
+        <w:rPr>
+          <w:rFonts w:ascii="Open Sans" w:hAnsi="Open Sans"/>
+        </w:rPr>
+      </w:pPr>
+      <w:r>
+        <w:rPr>
+          <w:rFonts w:ascii="Open Sans" w:hAnsi="Open Sans"/>
+          <w:lang w:val="de-DE"/>
+        </w:rPr>
+        <w:t>Der Auftrag kommt erst mit schriftlicher Zustimmung des Vermieters zustande.{/VermieterZustimmungHinweis}</w:t>
       </w:r>
     </w:p>
     <w:p>
@@ -3289,8 +3279,12 @@
     <w:p>
       <w:pPr>
         <w:pStyle w:val="Normal"/>
+        <w:widowControl w:val="false"/>
+        <w:suppressAutoHyphens w:val="true"/>
+        <w:bidi w:val="0"/>
         <w:spacing w:lineRule="auto" w:line="286" w:before="215" w:after="0"/>
-        <w:ind w:left="123" w:right="222"/>
+        <w:ind w:hanging="0" w:left="0" w:right="0"/>
+        <w:jc w:val="left"/>
         <w:rPr>
           <w:rFonts w:ascii="Open Sans" w:hAnsi="Open Sans" w:eastAsia="Open Sans" w:cs="Open Sans"/>
           <w:color w:val="000000"/>
@@ -3359,7 +3353,12 @@
     <w:p>
       <w:pPr>
         <w:pStyle w:val="Normal"/>
-        <w:ind w:left="123"/>
+        <w:widowControl w:val="false"/>
+        <w:suppressAutoHyphens w:val="true"/>
+        <w:bidi w:val="0"/>
+        <w:spacing w:before="0" w:after="0"/>
+        <w:ind w:hanging="0" w:left="0" w:right="0"/>
+        <w:jc w:val="left"/>
         <w:rPr>
           <w:rFonts w:ascii="Open Sans" w:hAnsi="Open Sans" w:eastAsia="Open Sans" w:cs="Open Sans"/>
           <w:color w:val="000000"/>
@@ -4919,6 +4918,270 @@
     </w:r>
   </w:p>
 </w:hdr>
+</file>
+
+<file path=word/numbering.xml><?xml version="1.0" encoding="utf-8"?>
+<w:numbering xmlns:w="http://schemas.openxmlformats.org/wordprocessingml/2006/main" xmlns:o="urn:schemas-microsoft-com:office:office" xmlns:r="http://schemas.openxmlformats.org/officeDocument/2006/relationships" xmlns:v="urn:schemas-microsoft-com:vml" xmlns:mc="http://schemas.openxmlformats.org/markup-compatibility/2006" xmlns:w14="http://schemas.microsoft.com/office/word/2010/wordml" mc:Ignorable="w14">
+  <w:abstractNum w:abstractNumId="1">
+    <w:lvl w:ilvl="0">
+      <w:start w:val="1"/>
+      <w:numFmt w:val="bullet"/>
+      <w:lvlText w:val=""/>
+      <w:lvlJc w:val="left"/>
+      <w:pPr>
+        <w:ind w:left="-303" w:hanging="360"/>
+      </w:pPr>
+      <w:rPr>
+        <w:rFonts w:ascii="Symbol" w:hAnsi="Symbol" w:cs="Symbol" w:hint="default"/>
+      </w:rPr>
+    </w:lvl>
+    <w:lvl w:ilvl="1">
+      <w:start w:val="1"/>
+      <w:numFmt w:val="bullet"/>
+      <w:lvlText w:val=""/>
+      <w:lvlJc w:val="left"/>
+      <w:pPr>
+        <w:tabs>
+          <w:tab w:val="num" w:pos="57"/>
+        </w:tabs>
+        <w:ind w:left="57" w:hanging="360"/>
+      </w:pPr>
+      <w:rPr>
+        <w:rFonts w:ascii="Symbol" w:hAnsi="Symbol" w:cs="Symbol" w:hint="default"/>
+      </w:rPr>
+    </w:lvl>
+    <w:lvl w:ilvl="2">
+      <w:start w:val="1"/>
+      <w:numFmt w:val="bullet"/>
+      <w:lvlText w:val=""/>
+      <w:lvlJc w:val="left"/>
+      <w:pPr>
+        <w:tabs>
+          <w:tab w:val="num" w:pos="417"/>
+        </w:tabs>
+        <w:ind w:left="417" w:hanging="360"/>
+      </w:pPr>
+      <w:rPr>
+        <w:rFonts w:ascii="Symbol" w:hAnsi="Symbol" w:cs="Symbol" w:hint="default"/>
+      </w:rPr>
+    </w:lvl>
+    <w:lvl w:ilvl="3">
+      <w:start w:val="1"/>
+      <w:numFmt w:val="bullet"/>
+      <w:lvlText w:val="●"/>
+      <w:lvlJc w:val="left"/>
+      <w:pPr>
+        <w:tabs>
+          <w:tab w:val="num" w:pos="1800"/>
+        </w:tabs>
+        <w:ind w:left="1800" w:hanging="360"/>
+      </w:pPr>
+      <w:rPr>
+        <w:rFonts w:ascii="Arial" w:hAnsi="Arial" w:cs="Arial" w:hint="default"/>
+      </w:rPr>
+    </w:lvl>
+    <w:lvl w:ilvl="4">
+      <w:start w:val="1"/>
+      <w:numFmt w:val="bullet"/>
+      <w:lvlText w:val=""/>
+      <w:lvlJc w:val="left"/>
+      <w:pPr>
+        <w:tabs>
+          <w:tab w:val="num" w:pos="1137"/>
+        </w:tabs>
+        <w:ind w:left="1137" w:hanging="360"/>
+      </w:pPr>
+      <w:rPr>
+        <w:rFonts w:ascii="Symbol" w:hAnsi="Symbol" w:cs="Symbol" w:hint="default"/>
+      </w:rPr>
+    </w:lvl>
+    <w:lvl w:ilvl="5">
+      <w:start w:val="1"/>
+      <w:numFmt w:val="bullet"/>
+      <w:lvlText w:val=""/>
+      <w:lvlJc w:val="left"/>
+      <w:pPr>
+        <w:tabs>
+          <w:tab w:val="num" w:pos="1497"/>
+        </w:tabs>
+        <w:ind w:left="1497" w:hanging="360"/>
+      </w:pPr>
+      <w:rPr>
+        <w:rFonts w:ascii="Symbol" w:hAnsi="Symbol" w:cs="Symbol" w:hint="default"/>
+      </w:rPr>
+    </w:lvl>
+    <w:lvl w:ilvl="6">
+      <w:start w:val="1"/>
+      <w:numFmt w:val="bullet"/>
+      <w:lvlText w:val=""/>
+      <w:lvlJc w:val="left"/>
+      <w:pPr>
+        <w:tabs>
+          <w:tab w:val="num" w:pos="1857"/>
+        </w:tabs>
+        <w:ind w:left="1857" w:hanging="360"/>
+      </w:pPr>
+      <w:rPr>
+        <w:rFonts w:ascii="Symbol" w:hAnsi="Symbol" w:cs="Symbol" w:hint="default"/>
+      </w:rPr>
+    </w:lvl>
+    <w:lvl w:ilvl="7">
+      <w:start w:val="1"/>
+      <w:numFmt w:val="bullet"/>
+      <w:lvlText w:val=""/>
+      <w:lvlJc w:val="left"/>
+      <w:pPr>
+        <w:tabs>
+          <w:tab w:val="num" w:pos="2217"/>
+        </w:tabs>
+        <w:ind w:left="2217" w:hanging="360"/>
+      </w:pPr>
+      <w:rPr>
+        <w:rFonts w:ascii="Symbol" w:hAnsi="Symbol" w:cs="Symbol" w:hint="default"/>
+      </w:rPr>
+    </w:lvl>
+    <w:lvl w:ilvl="8">
+      <w:start w:val="1"/>
+      <w:numFmt w:val="bullet"/>
+      <w:lvlText w:val=""/>
+      <w:lvlJc w:val="left"/>
+      <w:pPr>
+        <w:tabs>
+          <w:tab w:val="num" w:pos="2577"/>
+        </w:tabs>
+        <w:ind w:left="2577" w:hanging="360"/>
+      </w:pPr>
+      <w:rPr>
+        <w:rFonts w:ascii="Symbol" w:hAnsi="Symbol" w:cs="Symbol" w:hint="default"/>
+      </w:rPr>
+    </w:lvl>
+  </w:abstractNum>
+  <w:abstractNum w:abstractNumId="2">
+    <w:lvl w:ilvl="0">
+      <w:start w:val="1"/>
+      <w:numFmt w:val="none"/>
+      <w:suff w:val="nothing"/>
+      <w:lvlText w:val=""/>
+      <w:lvlJc w:val="left"/>
+      <w:pPr>
+        <w:tabs>
+          <w:tab w:val="num" w:pos="0"/>
+        </w:tabs>
+        <w:ind w:left="0" w:hanging="0"/>
+      </w:pPr>
+    </w:lvl>
+    <w:lvl w:ilvl="1">
+      <w:start w:val="1"/>
+      <w:numFmt w:val="none"/>
+      <w:suff w:val="nothing"/>
+      <w:lvlText w:val=""/>
+      <w:lvlJc w:val="left"/>
+      <w:pPr>
+        <w:tabs>
+          <w:tab w:val="num" w:pos="0"/>
+        </w:tabs>
+        <w:ind w:left="0" w:hanging="0"/>
+      </w:pPr>
+    </w:lvl>
+    <w:lvl w:ilvl="2">
+      <w:start w:val="1"/>
+      <w:numFmt w:val="none"/>
+      <w:suff w:val="nothing"/>
+      <w:lvlText w:val=""/>
+      <w:lvlJc w:val="left"/>
+      <w:pPr>
+        <w:tabs>
+          <w:tab w:val="num" w:pos="0"/>
+        </w:tabs>
+        <w:ind w:left="0" w:hanging="0"/>
+      </w:pPr>
+    </w:lvl>
+    <w:lvl w:ilvl="3">
+      <w:start w:val="1"/>
+      <w:numFmt w:val="none"/>
+      <w:suff w:val="nothing"/>
+      <w:lvlText w:val=""/>
+      <w:lvlJc w:val="left"/>
+      <w:pPr>
+        <w:tabs>
+          <w:tab w:val="num" w:pos="0"/>
+        </w:tabs>
+        <w:ind w:left="0" w:hanging="0"/>
+      </w:pPr>
+    </w:lvl>
+    <w:lvl w:ilvl="4">
+      <w:start w:val="1"/>
+      <w:numFmt w:val="none"/>
+      <w:suff w:val="nothing"/>
+      <w:lvlText w:val=""/>
+      <w:lvlJc w:val="left"/>
+      <w:pPr>
+        <w:tabs>
+          <w:tab w:val="num" w:pos="0"/>
+        </w:tabs>
+        <w:ind w:left="0" w:hanging="0"/>
+      </w:pPr>
+    </w:lvl>
+    <w:lvl w:ilvl="5">
+      <w:start w:val="1"/>
+      <w:numFmt w:val="none"/>
+      <w:suff w:val="nothing"/>
+      <w:lvlText w:val=""/>
+      <w:lvlJc w:val="left"/>
+      <w:pPr>
+        <w:tabs>
+          <w:tab w:val="num" w:pos="0"/>
+        </w:tabs>
+        <w:ind w:left="0" w:hanging="0"/>
+      </w:pPr>
+    </w:lvl>
+    <w:lvl w:ilvl="6">
+      <w:start w:val="1"/>
+      <w:numFmt w:val="none"/>
+      <w:suff w:val="nothing"/>
+      <w:lvlText w:val=""/>
+      <w:lvlJc w:val="left"/>
+      <w:pPr>
+        <w:tabs>
+          <w:tab w:val="num" w:pos="0"/>
+        </w:tabs>
+        <w:ind w:left="0" w:hanging="0"/>
+      </w:pPr>
+    </w:lvl>
+    <w:lvl w:ilvl="7">
+      <w:start w:val="1"/>
+      <w:numFmt w:val="none"/>
+      <w:suff w:val="nothing"/>
+      <w:lvlText w:val=""/>
+      <w:lvlJc w:val="left"/>
+      <w:pPr>
+        <w:tabs>
+          <w:tab w:val="num" w:pos="0"/>
+        </w:tabs>
+        <w:ind w:left="0" w:hanging="0"/>
+      </w:pPr>
+    </w:lvl>
+    <w:lvl w:ilvl="8">
+      <w:start w:val="1"/>
+      <w:numFmt w:val="none"/>
+      <w:suff w:val="nothing"/>
+      <w:lvlText w:val=""/>
+      <w:lvlJc w:val="left"/>
+      <w:pPr>
+        <w:tabs>
+          <w:tab w:val="num" w:pos="0"/>
+        </w:tabs>
+        <w:ind w:left="0" w:hanging="0"/>
+      </w:pPr>
+    </w:lvl>
+  </w:abstractNum>
+  <w:num w:numId="1">
+    <w:abstractNumId w:val="1"/>
+  </w:num>
+  <w:num w:numId="2">
+    <w:abstractNumId w:val="2"/>
+  </w:num>
+</w:numbering>
 </file>
 
 <file path=word/styles.xml><?xml version="1.0" encoding="utf-8"?>
@@ -5550,6 +5813,25 @@
       <w:sz w:val="21"/>
     </w:rPr>
   </w:style>
+  <w:style w:type="character" w:styleId="Bulletsuser">
+    <w:name w:val="Bullets (user)"/>
+    <w:qFormat/>
+    <w:rPr>
+      <w:rFonts w:ascii="OpenSymbol" w:hAnsi="OpenSymbol" w:eastAsia="OpenSymbol" w:cs="OpenSymbol"/>
+    </w:rPr>
+  </w:style>
+  <w:style w:type="character" w:styleId="Bullets">
+    <w:name w:val="Bullets"/>
+    <w:qFormat/>
+    <w:rPr>
+      <w:rFonts w:ascii="OpenSymbol" w:hAnsi="OpenSymbol" w:eastAsia="OpenSymbol" w:cs="OpenSymbol"/>
+    </w:rPr>
+  </w:style>
+  <w:style w:type="character" w:styleId="NumberingSymbols">
+    <w:name w:val="Numbering Symbols"/>
+    <w:qFormat/>
+    <w:rPr/>
+  </w:style>
   <w:style w:type="paragraph" w:styleId="Heading" w:customStyle="1">
     <w:name w:val="Heading"/>
     <w:basedOn w:val="Normal"/>
@@ -5698,6 +5980,10 @@
     <w:uiPriority w:val="99"/>
     <w:semiHidden/>
     <w:unhideWhenUsed/>
+    <w:qFormat/>
+  </w:style>
+  <w:style w:type="numbering" w:styleId="Bullet">
+    <w:name w:val="Bullet •"/>
     <w:qFormat/>
   </w:style>
   <w:style w:type="table" w:default="1" w:styleId="Standardowy">

</xml_diff>

<commit_message>
feat(angebot): new Pflegekasse + Vermieter wording, Vermieter-Satz for HL
- Pflegekasse sentence: order becomes void only on final rejection (even
  after Widerspruch); self-pay at the offered price stays possible.
- Vermieter sentence: "setzt die schriftliche Zustimmung Ihres Vermieters
  voraus"; Kassenkunden additionally get the "spätestens mit der
  Zuschussbestätigung" line.
- Updated in Angebot-10, BU-KK-2, BWT, HL templates and the online
  signing page (signing-docs.js).
- HL now gets the Vermieter question, upload, Bitrix prefill and sentence
  like BU/BWT.

Co-Authored-By: Claude Opus 5.5 <noreply@anthropic.com>
</commit_message>
<xml_diff>
--- a/src/templates/Angebot-10.docx
+++ b/src/templates/Angebot-10.docx
@@ -28,7 +28,7 @@
         <mc:AlternateContent>
           <mc:Choice Requires="wps">
             <w:drawing>
-              <wp:anchor behindDoc="0" distT="72390" distB="72390" distL="70485" distR="72390" simplePos="0" locked="0" layoutInCell="0" allowOverlap="1" relativeHeight="5">
+              <wp:anchor behindDoc="0" distT="72390" distB="72390" distL="69215" distR="72390" simplePos="0" locked="0" layoutInCell="0" allowOverlap="1" relativeHeight="5">
                 <wp:simplePos x="0" y="0"/>
                 <wp:positionH relativeFrom="page">
                   <wp:posOffset>720090</wp:posOffset>
@@ -134,8 +134,8 @@
                               <w:tblLook w:val="04a0" w:noVBand="1" w:noHBand="0" w:lastColumn="0" w:firstColumn="1" w:lastRow="0" w:firstRow="1"/>
                             </w:tblPr>
                             <w:tblGrid>
-                              <w:gridCol w:w="4796"/>
-                              <w:gridCol w:w="2404"/>
+                              <w:gridCol w:w="4795"/>
+                              <w:gridCol w:w="2405"/>
                               <w:gridCol w:w="2835"/>
                             </w:tblGrid>
                             <w:tr>
@@ -144,7 +144,7 @@
                               </w:trPr>
                               <w:tc>
                                 <w:tcPr>
-                                  <w:tcW w:w="4796" w:type="dxa"/>
+                                  <w:tcW w:w="4795" w:type="dxa"/>
                                   <w:tcBorders>
                                     <w:top w:val="single" w:sz="8" w:space="0" w:color="FFFFFF"/>
                                     <w:left w:val="single" w:sz="8" w:space="0" w:color="FFFFFF"/>
@@ -248,7 +248,7 @@
                               </w:tc>
                               <w:tc>
                                 <w:tcPr>
-                                  <w:tcW w:w="2404" w:type="dxa"/>
+                                  <w:tcW w:w="2405" w:type="dxa"/>
                                   <w:tcBorders>
                                     <w:top w:val="single" w:sz="8" w:space="0" w:color="FFFFFF"/>
                                     <w:left w:val="single" w:sz="8" w:space="0" w:color="FFFFFF"/>
@@ -729,8 +729,8 @@
                         <w:tblLook w:val="04a0" w:noVBand="1" w:noHBand="0" w:lastColumn="0" w:firstColumn="1" w:lastRow="0" w:firstRow="1"/>
                       </w:tblPr>
                       <w:tblGrid>
-                        <w:gridCol w:w="4796"/>
-                        <w:gridCol w:w="2404"/>
+                        <w:gridCol w:w="4795"/>
+                        <w:gridCol w:w="2405"/>
                         <w:gridCol w:w="2835"/>
                       </w:tblGrid>
                       <w:tr>
@@ -739,7 +739,7 @@
                         </w:trPr>
                         <w:tc>
                           <w:tcPr>
-                            <w:tcW w:w="4796" w:type="dxa"/>
+                            <w:tcW w:w="4795" w:type="dxa"/>
                             <w:tcBorders>
                               <w:top w:val="single" w:sz="8" w:space="0" w:color="FFFFFF"/>
                               <w:left w:val="single" w:sz="8" w:space="0" w:color="FFFFFF"/>
@@ -843,7 +843,7 @@
                         </w:tc>
                         <w:tc>
                           <w:tcPr>
-                            <w:tcW w:w="2404" w:type="dxa"/>
+                            <w:tcW w:w="2405" w:type="dxa"/>
                             <w:tcBorders>
                               <w:top w:val="single" w:sz="8" w:space="0" w:color="FFFFFF"/>
                               <w:left w:val="single" w:sz="8" w:space="0" w:color="FFFFFF"/>
@@ -3231,27 +3231,21 @@
           <w:rFonts w:ascii="Open Sans" w:hAnsi="Open Sans"/>
           <w:lang w:val="de-DE"/>
         </w:rPr>
-        <w:t>Der Auftrag kommt erst mit schriftlicher Zustimmung des Vermieters zustande.{/VermieterZustimmungHinweis}</w:t>
+        <w:t>Dieser Auftrag setzt die schriftliche Zustimmung Ihres Vermieters voraus.{/VermieterZustimmungHinweis}</w:t>
       </w:r>
     </w:p>
     <w:p>
       <w:pPr>
         <w:pStyle w:val="Normal"/>
-        <w:spacing w:lineRule="auto" w:line="283"/>
+        <w:spacing w:lineRule="auto" w:line="283" w:before="170" w:after="0"/>
         <w:ind w:left="125" w:right="1024"/>
         <w:rPr>
-          <w:rFonts w:ascii="Open Sans" w:hAnsi="Open Sans" w:eastAsia="Open Sans" w:cs="Open Sans"/>
-          <w:b/>
-          <w:bCs/>
-          <w:i/>
-          <w:i/>
-          <w:iCs/>
-          <w:color w:val="030303"/>
-          <w:lang w:val="de-DE"/>
+          <w:rFonts w:ascii="Open Sans" w:hAnsi="Open Sans"/>
         </w:rPr>
       </w:pPr>
       <w:r>
         <w:rPr>
+          <w:rFonts w:ascii="Open Sans" w:hAnsi="Open Sans"/>
           <w:lang w:val="de-DE"/>
         </w:rPr>
         <w:t>{#SelfPayLines}</w:t>
@@ -3260,7 +3254,7 @@
       </w:r>
       <w:r>
         <w:rPr>
-          <w:rFonts w:ascii="Open Sans" w:hAnsi="Open Sans" w:eastAsia="Open Sans" w:cs="Open Sans"/>
+          <w:rFonts w:eastAsia="Open Sans" w:cs="Open Sans" w:ascii="Open Sans" w:hAnsi="Open Sans"/>
           <w:b/>
           <w:color w:val="030303"/>
           <w:lang w:val="de-DE"/>
@@ -3269,7 +3263,7 @@
       </w:r>
       <w:r>
         <w:rPr>
-          <w:rFonts w:ascii="Open Sans" w:hAnsi="Open Sans" w:eastAsia="Open Sans" w:cs="Open Sans"/>
+          <w:rFonts w:eastAsia="Open Sans" w:cs="Open Sans" w:ascii="Open Sans" w:hAnsi="Open Sans"/>
           <w:color w:val="030303"/>
           <w:lang w:val="de-DE"/>
         </w:rPr>
@@ -4929,6 +4923,9 @@
       <w:lvlText w:val=""/>
       <w:lvlJc w:val="left"/>
       <w:pPr>
+        <w:tabs>
+          <w:tab w:val="num" w:pos="0"/>
+        </w:tabs>
         <w:ind w:left="-303" w:hanging="360"/>
       </w:pPr>
       <w:rPr>
@@ -5813,15 +5810,15 @@
       <w:sz w:val="21"/>
     </w:rPr>
   </w:style>
-  <w:style w:type="character" w:styleId="Bulletsuser">
-    <w:name w:val="Bullets (user)"/>
+  <w:style w:type="character" w:styleId="Bullets">
+    <w:name w:val="Bullets"/>
     <w:qFormat/>
     <w:rPr>
       <w:rFonts w:ascii="OpenSymbol" w:hAnsi="OpenSymbol" w:eastAsia="OpenSymbol" w:cs="OpenSymbol"/>
     </w:rPr>
   </w:style>
-  <w:style w:type="character" w:styleId="Bullets">
-    <w:name w:val="Bullets"/>
+  <w:style w:type="character" w:styleId="Bulletsuser">
+    <w:name w:val="Bullets (user)"/>
     <w:qFormat/>
     <w:rPr>
       <w:rFonts w:ascii="OpenSymbol" w:hAnsi="OpenSymbol" w:eastAsia="OpenSymbol" w:cs="OpenSymbol"/>
@@ -5961,15 +5958,15 @@
     <w:pPr/>
     <w:rPr/>
   </w:style>
-  <w:style w:type="paragraph" w:styleId="FrameContentsuser">
-    <w:name w:val="Frame Contents (user)"/>
+  <w:style w:type="paragraph" w:styleId="FrameContents">
+    <w:name w:val="Frame Contents"/>
     <w:basedOn w:val="Normal"/>
     <w:qFormat/>
     <w:pPr/>
     <w:rPr/>
   </w:style>
-  <w:style w:type="paragraph" w:styleId="FrameContents">
-    <w:name w:val="Frame Contents"/>
+  <w:style w:type="paragraph" w:styleId="FrameContentsuser">
+    <w:name w:val="Frame Contents (user)"/>
     <w:basedOn w:val="Normal"/>
     <w:qFormat/>
     <w:pPr/>
@@ -5982,8 +5979,8 @@
     <w:unhideWhenUsed/>
     <w:qFormat/>
   </w:style>
-  <w:style w:type="numbering" w:styleId="Bullet">
-    <w:name w:val="Bullet •"/>
+  <w:style w:type="numbering" w:styleId="Bulletuser">
+    <w:name w:val="Bullet • (user)"/>
     <w:qFormat/>
   </w:style>
   <w:style w:type="table" w:default="1" w:styleId="Standardowy">

</xml_diff>